<commit_message>
Encore brief: add 'Adjacent, not derivative' ROAR positioning
Folds the Michael Clinton / ROAR forward competitive research into the
concept brief: ROAR is a Hearst-backed, B2B longevity-intelligence +
inspiration platform ("reinvent who you are"); Encore claims the adjacent
"build what's next" lane. Adds a head-to-head comparison table, six
differentiation moves (playbooks over profiles, The Table as the product,
reader-funded vow, operator credibility, sharper 55-75 cohort,
network-over-founder), and a "where not to fight" guardrail.

Co-Authored-By: Claude Opus 4.8 (1M context) <noreply@anthropic.com>
Claude-Session: https://claude.ai/code/session_01MZCcvfRxTVSc6PAak7p1Nw
</commit_message>
<xml_diff>
--- a/Encore_Concept_Brief.docx
+++ b/Encore_Concept_Brief.docx
@@ -1586,6 +1586,742 @@
           <w:color w:val="6E2A35"/>
           <w:sz w:val="30"/>
         </w:rPr>
+        <w:t>Adjacent, not derivative — Encore and ROAR</w:t>
+      </w:r>
+    </w:p>
+    <w:p>
+      <w:pPr>
+        <w:spacing w:after="120"/>
+      </w:pPr>
+      <w:r>
+        <w:rPr>
+          <w:i w:val="0"/>
+          <w:sz w:val="21"/>
+        </w:rPr>
+        <w:t xml:space="preserve">The most credible incumbent is </w:t>
+      </w:r>
+      <w:r>
+        <w:rPr>
+          <w:b/>
+          <w:i w:val="0"/>
+          <w:sz w:val="21"/>
+        </w:rPr>
+        <w:t>Michael Clinton's ROAR forward</w:t>
+      </w:r>
+      <w:r>
+        <w:rPr>
+          <w:i w:val="0"/>
+          <w:sz w:val="21"/>
+        </w:rPr>
+        <w:t xml:space="preserve"> — a Hearst-backed platform built on his book *ROAR* (and the newer *Longevity Nation*). His body of work and Rolodex are exceptional and not worth copying. The good news: ROAR's center of gravity is </w:t>
+      </w:r>
+      <w:r>
+        <w:rPr>
+          <w:b/>
+          <w:i w:val="0"/>
+          <w:sz w:val="21"/>
+        </w:rPr>
+        <w:t>B2B 'longevity-economy' intelligence sold to brands</w:t>
+      </w:r>
+      <w:r>
+        <w:rPr>
+          <w:i w:val="0"/>
+          <w:sz w:val="21"/>
+        </w:rPr>
+        <w:t xml:space="preserve"> (the ROAR Report, a sponsored-content studio, an invitational Hearst-Tower Summit), wrapped in </w:t>
+      </w:r>
+      <w:r>
+        <w:rPr>
+          <w:b/>
+          <w:i w:val="0"/>
+          <w:sz w:val="21"/>
+        </w:rPr>
+        <w:t>inspiration and identity reinvention</w:t>
+      </w:r>
+      <w:r>
+        <w:rPr>
+          <w:i w:val="0"/>
+          <w:sz w:val="21"/>
+        </w:rPr>
+        <w:t xml:space="preserve"> with a lifestyle/beauty tilt. That leaves a clean, defensible lane.</w:t>
+      </w:r>
+    </w:p>
+    <w:p>
+      <w:pPr>
+        <w:spacing w:after="120"/>
+      </w:pPr>
+      <w:r>
+        <w:rPr>
+          <w:b/>
+          <w:i w:val="0"/>
+          <w:color w:val="6E2A35"/>
+          <w:sz w:val="23"/>
+        </w:rPr>
+        <w:t>The one-line distinction: ROAR owns 'reinvent who you are.' Encore owns 'build what's next.'</w:t>
+      </w:r>
+    </w:p>
+    <w:tbl>
+      <w:tblPr>
+        <w:tblStyle w:val="TableGrid"/>
+        <w:tblW w:type="auto" w:w="0"/>
+        <w:jc w:val="center"/>
+        <w:tblLook w:firstColumn="1" w:firstRow="1" w:lastColumn="0" w:lastRow="0" w:noHBand="0" w:noVBand="1" w:val="04A0"/>
+      </w:tblPr>
+      <w:tblGrid>
+        <w:gridCol w:w="3216"/>
+        <w:gridCol w:w="3216"/>
+        <w:gridCol w:w="3216"/>
+      </w:tblGrid>
+      <w:tr>
+        <w:tc>
+          <w:tcPr>
+            <w:tcW w:type="dxa" w:w="1728"/>
+            <w:shd w:val="clear" w:color="auto" w:fill="6E2A35"/>
+          </w:tcPr>
+          <w:p>
+            <w:pPr>
+              <w:jc w:val="left"/>
+            </w:pPr>
+            <w:r/>
+            <w:r>
+              <w:rPr>
+                <w:b/>
+                <w:color w:val="FFFFFF"/>
+                <w:sz w:val="17"/>
+              </w:rPr>
+              <w:t>Dimension</w:t>
+            </w:r>
+          </w:p>
+        </w:tc>
+        <w:tc>
+          <w:tcPr>
+            <w:tcW w:type="dxa" w:w="3888"/>
+            <w:shd w:val="clear" w:color="auto" w:fill="6E2A35"/>
+          </w:tcPr>
+          <w:p>
+            <w:pPr>
+              <w:jc w:val="left"/>
+            </w:pPr>
+            <w:r/>
+            <w:r>
+              <w:rPr>
+                <w:b/>
+                <w:color w:val="FFFFFF"/>
+                <w:sz w:val="17"/>
+              </w:rPr>
+              <w:t>ROAR forward (Clinton)</w:t>
+            </w:r>
+          </w:p>
+        </w:tc>
+        <w:tc>
+          <w:tcPr>
+            <w:tcW w:type="dxa" w:w="4032"/>
+            <w:shd w:val="clear" w:color="auto" w:fill="6E2A35"/>
+          </w:tcPr>
+          <w:p>
+            <w:pPr>
+              <w:jc w:val="left"/>
+            </w:pPr>
+            <w:r/>
+            <w:r>
+              <w:rPr>
+                <w:b/>
+                <w:color w:val="FFFFFF"/>
+                <w:sz w:val="17"/>
+              </w:rPr>
+              <w:t>Encore</w:t>
+            </w:r>
+          </w:p>
+        </w:tc>
+      </w:tr>
+      <w:tr>
+        <w:tc>
+          <w:tcPr>
+            <w:tcW w:type="dxa" w:w="1728"/>
+            <w:shd w:val="clear" w:color="auto" w:fill="FBF8F2"/>
+          </w:tcPr>
+          <w:p>
+            <w:pPr>
+              <w:jc w:val="left"/>
+            </w:pPr>
+            <w:r/>
+            <w:r>
+              <w:rPr>
+                <w:b/>
+                <w:color w:val="23282E"/>
+                <w:sz w:val="16"/>
+              </w:rPr>
+              <w:t>Core promise</w:t>
+            </w:r>
+          </w:p>
+        </w:tc>
+        <w:tc>
+          <w:tcPr>
+            <w:tcW w:type="dxa" w:w="3888"/>
+            <w:shd w:val="clear" w:color="auto" w:fill="FBF8F2"/>
+          </w:tcPr>
+          <w:p>
+            <w:pPr>
+              <w:jc w:val="left"/>
+            </w:pPr>
+            <w:r/>
+            <w:r>
+              <w:rPr>
+                <w:b w:val="0"/>
+                <w:sz w:val="16"/>
+              </w:rPr>
+              <w:t>Reinvent who you are (identity / mindset)</w:t>
+            </w:r>
+          </w:p>
+        </w:tc>
+        <w:tc>
+          <w:tcPr>
+            <w:tcW w:type="dxa" w:w="4032"/>
+            <w:shd w:val="clear" w:color="auto" w:fill="FBF8F2"/>
+          </w:tcPr>
+          <w:p>
+            <w:pPr>
+              <w:jc w:val="left"/>
+            </w:pPr>
+            <w:r/>
+            <w:r>
+              <w:rPr>
+                <w:b w:val="0"/>
+                <w:sz w:val="16"/>
+              </w:rPr>
+              <w:t>Build what's next — the work of the second act</w:t>
+            </w:r>
+          </w:p>
+        </w:tc>
+      </w:tr>
+      <w:tr>
+        <w:tc>
+          <w:tcPr>
+            <w:tcW w:type="dxa" w:w="1728"/>
+            <w:shd w:val="clear" w:color="auto" w:fill="FFFFFF"/>
+          </w:tcPr>
+          <w:p>
+            <w:pPr>
+              <w:jc w:val="left"/>
+            </w:pPr>
+            <w:r/>
+            <w:r>
+              <w:rPr>
+                <w:b/>
+                <w:color w:val="23282E"/>
+                <w:sz w:val="16"/>
+              </w:rPr>
+              <w:t>Founder authority</w:t>
+            </w:r>
+          </w:p>
+        </w:tc>
+        <w:tc>
+          <w:tcPr>
+            <w:tcW w:type="dxa" w:w="3888"/>
+            <w:shd w:val="clear" w:color="auto" w:fill="FFFFFF"/>
+          </w:tcPr>
+          <w:p>
+            <w:pPr>
+              <w:jc w:val="left"/>
+            </w:pPr>
+            <w:r/>
+            <w:r>
+              <w:rPr>
+                <w:b w:val="0"/>
+                <w:sz w:val="16"/>
+              </w:rPr>
+              <w:t>Famous publisher who reinvented himself</w:t>
+            </w:r>
+          </w:p>
+        </w:tc>
+        <w:tc>
+          <w:tcPr>
+            <w:tcW w:type="dxa" w:w="4032"/>
+            <w:shd w:val="clear" w:color="auto" w:fill="FFFFFF"/>
+          </w:tcPr>
+          <w:p>
+            <w:pPr>
+              <w:jc w:val="left"/>
+            </w:pPr>
+            <w:r/>
+            <w:r>
+              <w:rPr>
+                <w:b w:val="0"/>
+                <w:sz w:val="16"/>
+              </w:rPr>
+              <w:t>Operator — built, ran, exited; an author who did it</w:t>
+            </w:r>
+          </w:p>
+        </w:tc>
+      </w:tr>
+      <w:tr>
+        <w:tc>
+          <w:tcPr>
+            <w:tcW w:type="dxa" w:w="1728"/>
+            <w:shd w:val="clear" w:color="auto" w:fill="FBF8F2"/>
+          </w:tcPr>
+          <w:p>
+            <w:pPr>
+              <w:jc w:val="left"/>
+            </w:pPr>
+            <w:r/>
+            <w:r>
+              <w:rPr>
+                <w:b/>
+                <w:color w:val="23282E"/>
+                <w:sz w:val="16"/>
+              </w:rPr>
+              <w:t>Shape</w:t>
+            </w:r>
+          </w:p>
+        </w:tc>
+        <w:tc>
+          <w:tcPr>
+            <w:tcW w:type="dxa" w:w="3888"/>
+            <w:shd w:val="clear" w:color="auto" w:fill="FBF8F2"/>
+          </w:tcPr>
+          <w:p>
+            <w:pPr>
+              <w:jc w:val="left"/>
+            </w:pPr>
+            <w:r/>
+            <w:r>
+              <w:rPr>
+                <w:b w:val="0"/>
+                <w:sz w:val="16"/>
+              </w:rPr>
+              <w:t>Broadcast: host → audience, role-model profiles</w:t>
+            </w:r>
+          </w:p>
+        </w:tc>
+        <w:tc>
+          <w:tcPr>
+            <w:tcW w:type="dxa" w:w="4032"/>
+            <w:shd w:val="clear" w:color="auto" w:fill="FBF8F2"/>
+          </w:tcPr>
+          <w:p>
+            <w:pPr>
+              <w:jc w:val="left"/>
+            </w:pPr>
+            <w:r/>
+            <w:r>
+              <w:rPr>
+                <w:b w:val="0"/>
+                <w:sz w:val="16"/>
+              </w:rPr>
+              <w:t>Peer network: members transact (The Table)</w:t>
+            </w:r>
+          </w:p>
+        </w:tc>
+      </w:tr>
+      <w:tr>
+        <w:tc>
+          <w:tcPr>
+            <w:tcW w:type="dxa" w:w="1728"/>
+            <w:shd w:val="clear" w:color="auto" w:fill="FFFFFF"/>
+          </w:tcPr>
+          <w:p>
+            <w:pPr>
+              <w:jc w:val="left"/>
+            </w:pPr>
+            <w:r/>
+            <w:r>
+              <w:rPr>
+                <w:b/>
+                <w:color w:val="23282E"/>
+                <w:sz w:val="16"/>
+              </w:rPr>
+              <w:t>Money</w:t>
+            </w:r>
+          </w:p>
+        </w:tc>
+        <w:tc>
+          <w:tcPr>
+            <w:tcW w:type="dxa" w:w="3888"/>
+            <w:shd w:val="clear" w:color="auto" w:fill="FFFFFF"/>
+          </w:tcPr>
+          <w:p>
+            <w:pPr>
+              <w:jc w:val="left"/>
+            </w:pPr>
+            <w:r/>
+            <w:r>
+              <w:rPr>
+                <w:b w:val="0"/>
+                <w:sz w:val="16"/>
+              </w:rPr>
+              <w:t>Sells longevity insight to brands; sponsored content</w:t>
+            </w:r>
+          </w:p>
+        </w:tc>
+        <w:tc>
+          <w:tcPr>
+            <w:tcW w:type="dxa" w:w="4032"/>
+            <w:shd w:val="clear" w:color="auto" w:fill="FFFFFF"/>
+          </w:tcPr>
+          <w:p>
+            <w:pPr>
+              <w:jc w:val="left"/>
+            </w:pPr>
+            <w:r/>
+            <w:r>
+              <w:rPr>
+                <w:b w:val="0"/>
+                <w:sz w:val="16"/>
+              </w:rPr>
+              <w:t>Reader-funded; no ads, no brand deals</w:t>
+            </w:r>
+          </w:p>
+        </w:tc>
+      </w:tr>
+      <w:tr>
+        <w:tc>
+          <w:tcPr>
+            <w:tcW w:type="dxa" w:w="1728"/>
+            <w:shd w:val="clear" w:color="auto" w:fill="FBF8F2"/>
+          </w:tcPr>
+          <w:p>
+            <w:pPr>
+              <w:jc w:val="left"/>
+            </w:pPr>
+            <w:r/>
+            <w:r>
+              <w:rPr>
+                <w:b/>
+                <w:color w:val="23282E"/>
+                <w:sz w:val="16"/>
+              </w:rPr>
+              <w:t>Audience</w:t>
+            </w:r>
+          </w:p>
+        </w:tc>
+        <w:tc>
+          <w:tcPr>
+            <w:tcW w:type="dxa" w:w="3888"/>
+            <w:shd w:val="clear" w:color="auto" w:fill="FBF8F2"/>
+          </w:tcPr>
+          <w:p>
+            <w:pPr>
+              <w:jc w:val="left"/>
+            </w:pPr>
+            <w:r/>
+            <w:r>
+              <w:rPr>
+                <w:b w:val="0"/>
+                <w:sz w:val="16"/>
+              </w:rPr>
+              <w:t>Broad 50+, lifestyle/beauty skew</w:t>
+            </w:r>
+          </w:p>
+        </w:tc>
+        <w:tc>
+          <w:tcPr>
+            <w:tcW w:type="dxa" w:w="4032"/>
+            <w:shd w:val="clear" w:color="auto" w:fill="FBF8F2"/>
+          </w:tcPr>
+          <w:p>
+            <w:pPr>
+              <w:jc w:val="left"/>
+            </w:pPr>
+            <w:r/>
+            <w:r>
+              <w:rPr>
+                <w:b w:val="0"/>
+                <w:sz w:val="16"/>
+              </w:rPr>
+              <w:t>Accomplished operators 55–75, builder energy</w:t>
+            </w:r>
+          </w:p>
+        </w:tc>
+      </w:tr>
+      <w:tr>
+        <w:tc>
+          <w:tcPr>
+            <w:tcW w:type="dxa" w:w="1728"/>
+            <w:shd w:val="clear" w:color="auto" w:fill="FFFFFF"/>
+          </w:tcPr>
+          <w:p>
+            <w:pPr>
+              <w:jc w:val="left"/>
+            </w:pPr>
+            <w:r/>
+            <w:r>
+              <w:rPr>
+                <w:b/>
+                <w:color w:val="23282E"/>
+                <w:sz w:val="16"/>
+              </w:rPr>
+              <w:t>Content</w:t>
+            </w:r>
+          </w:p>
+        </w:tc>
+        <w:tc>
+          <w:tcPr>
+            <w:tcW w:type="dxa" w:w="3888"/>
+            <w:shd w:val="clear" w:color="auto" w:fill="FFFFFF"/>
+          </w:tcPr>
+          <w:p>
+            <w:pPr>
+              <w:jc w:val="left"/>
+            </w:pPr>
+            <w:r/>
+            <w:r>
+              <w:rPr>
+                <w:b w:val="0"/>
+                <w:sz w:val="16"/>
+              </w:rPr>
+              <w:t>Inspiration &amp; profiles</w:t>
+            </w:r>
+          </w:p>
+        </w:tc>
+        <w:tc>
+          <w:tcPr>
+            <w:tcW w:type="dxa" w:w="4032"/>
+            <w:shd w:val="clear" w:color="auto" w:fill="FFFFFF"/>
+          </w:tcPr>
+          <w:p>
+            <w:pPr>
+              <w:jc w:val="left"/>
+            </w:pPr>
+            <w:r/>
+            <w:r>
+              <w:rPr>
+                <w:b w:val="0"/>
+                <w:sz w:val="16"/>
+              </w:rPr>
+              <w:t>Operational playbooks (angel checks, buy-a-business, boards)</w:t>
+            </w:r>
+          </w:p>
+        </w:tc>
+      </w:tr>
+      <w:tr>
+        <w:tc>
+          <w:tcPr>
+            <w:tcW w:type="dxa" w:w="1728"/>
+            <w:shd w:val="clear" w:color="auto" w:fill="FBF8F2"/>
+          </w:tcPr>
+          <w:p>
+            <w:pPr>
+              <w:jc w:val="left"/>
+            </w:pPr>
+            <w:r/>
+            <w:r>
+              <w:rPr>
+                <w:b/>
+                <w:color w:val="23282E"/>
+                <w:sz w:val="16"/>
+              </w:rPr>
+              <w:t>Events</w:t>
+            </w:r>
+          </w:p>
+        </w:tc>
+        <w:tc>
+          <w:tcPr>
+            <w:tcW w:type="dxa" w:w="3888"/>
+            <w:shd w:val="clear" w:color="auto" w:fill="FBF8F2"/>
+          </w:tcPr>
+          <w:p>
+            <w:pPr>
+              <w:jc w:val="left"/>
+            </w:pPr>
+            <w:r/>
+            <w:r>
+              <w:rPr>
+                <w:b w:val="0"/>
+                <w:sz w:val="16"/>
+              </w:rPr>
+              <w:t>Hearst-Tower Summit (stage, keynotes)</w:t>
+            </w:r>
+          </w:p>
+        </w:tc>
+        <w:tc>
+          <w:tcPr>
+            <w:tcW w:type="dxa" w:w="4032"/>
+            <w:shd w:val="clear" w:color="auto" w:fill="FBF8F2"/>
+          </w:tcPr>
+          <w:p>
+            <w:pPr>
+              <w:jc w:val="left"/>
+            </w:pPr>
+            <w:r/>
+            <w:r>
+              <w:rPr>
+                <w:b w:val="0"/>
+                <w:sz w:val="16"/>
+              </w:rPr>
+              <w:t>Small working retreats (deal reviews, pitch &amp; board prep)</w:t>
+            </w:r>
+          </w:p>
+        </w:tc>
+      </w:tr>
+    </w:tbl>
+    <w:p>
+      <w:pPr>
+        <w:spacing w:after="40"/>
+      </w:pPr>
+    </w:p>
+    <w:p>
+      <w:pPr>
+        <w:spacing w:after="120"/>
+      </w:pPr>
+      <w:r>
+        <w:rPr>
+          <w:b/>
+          <w:i w:val="0"/>
+          <w:sz w:val="21"/>
+        </w:rPr>
+        <w:t>Differentiation moves (adjacent, not derivative):</w:t>
+      </w:r>
+    </w:p>
+    <w:p>
+      <w:pPr>
+        <w:pStyle w:val="ListBullet"/>
+        <w:spacing w:after="60"/>
+      </w:pPr>
+      <w:r>
+        <w:rPr>
+          <w:b/>
+          <w:sz w:val="20"/>
+        </w:rPr>
+        <w:t>Lead with playbooks, not profiles</w:t>
+      </w:r>
+      <w:r>
+        <w:rPr>
+          <w:sz w:val="20"/>
+        </w:rPr>
+        <w:t xml:space="preserve"> — the promise is 'you'll *do* a thing this quarter,' not 'feel inspired.'</w:t>
+      </w:r>
+    </w:p>
+    <w:p>
+      <w:pPr>
+        <w:pStyle w:val="ListBullet"/>
+        <w:spacing w:after="60"/>
+      </w:pPr>
+      <w:r>
+        <w:rPr>
+          <w:b/>
+          <w:sz w:val="20"/>
+        </w:rPr>
+        <w:t>Make The Table the product, not a perk</w:t>
+      </w:r>
+      <w:r>
+        <w:rPr>
+          <w:sz w:val="20"/>
+        </w:rPr>
+        <w:t xml:space="preserve"> — member-to-member deal flow (asks/offers, angel syndicates, acquisition search, board matching). ROAR's members are an audience to monetize; ours are a network to transact in — a moat it can't copy without breaking its model.</w:t>
+      </w:r>
+    </w:p>
+    <w:p>
+      <w:pPr>
+        <w:pStyle w:val="ListBullet"/>
+        <w:spacing w:after="60"/>
+      </w:pPr>
+      <w:r>
+        <w:rPr>
+          <w:b/>
+          <w:sz w:val="20"/>
+        </w:rPr>
+        <w:t>Bank the reader-funded vow loudly</w:t>
+      </w:r>
+      <w:r>
+        <w:rPr>
+          <w:sz w:val="20"/>
+        </w:rPr>
+        <w:t xml:space="preserve"> — 'no ads, no brand deals, we never sell you to marketers,' positioned directly against ROAR's sell-to-brands engine.</w:t>
+      </w:r>
+    </w:p>
+    <w:p>
+      <w:pPr>
+        <w:pStyle w:val="ListBullet"/>
+        <w:spacing w:after="60"/>
+      </w:pPr>
+      <w:r>
+        <w:rPr>
+          <w:b/>
+          <w:sz w:val="20"/>
+        </w:rPr>
+        <w:t>Weaponize operator credibility</w:t>
+      </w:r>
+      <w:r>
+        <w:rPr>
+          <w:sz w:val="20"/>
+        </w:rPr>
+        <w:t xml:space="preserve"> — the real math and mistakes of building, not 'follow your passion'; a faculty of retired *operators*, not lifestyle experts.</w:t>
+      </w:r>
+    </w:p>
+    <w:p>
+      <w:pPr>
+        <w:pStyle w:val="ListBullet"/>
+        <w:spacing w:after="60"/>
+      </w:pPr>
+      <w:r>
+        <w:rPr>
+          <w:b/>
+          <w:sz w:val="20"/>
+        </w:rPr>
+        <w:t>Sharpen the cohort</w:t>
+      </w:r>
+      <w:r>
+        <w:rPr>
+          <w:sz w:val="20"/>
+        </w:rPr>
+        <w:t xml:space="preserve"> — accomplished people 55–75 who are reinventing, *not* retiring; claim the builder/founder energy and the comparatively open operator lane.</w:t>
+      </w:r>
+    </w:p>
+    <w:p>
+      <w:pPr>
+        <w:pStyle w:val="ListBullet"/>
+        <w:spacing w:after="60"/>
+      </w:pPr>
+      <w:r>
+        <w:rPr>
+          <w:b/>
+          <w:sz w:val="20"/>
+        </w:rPr>
+        <w:t>Make the network — not the founder — the durable asset early</w:t>
+      </w:r>
+      <w:r>
+        <w:rPr>
+          <w:sz w:val="20"/>
+        </w:rPr>
+        <w:t>, so Encore outlasts any one voice (the risk both founder-led brands share).</w:t>
+      </w:r>
+    </w:p>
+    <w:p>
+      <w:pPr>
+        <w:spacing w:after="120"/>
+      </w:pPr>
+      <w:r>
+        <w:rPr>
+          <w:b/>
+          <w:i w:val="0"/>
+          <w:color w:val="5A6470"/>
+          <w:sz w:val="20"/>
+        </w:rPr>
+        <w:t>Where not to fight:</w:t>
+      </w:r>
+      <w:r>
+        <w:rPr>
+          <w:i w:val="0"/>
+          <w:color w:val="5A6470"/>
+          <w:sz w:val="20"/>
+        </w:rPr>
+        <w:t xml:space="preserve"> don't out-glossy ROAR on inspiration, don't chase its B2B 'sell longevity insight to brands' model (its core, with Hearst behind it), and don't stage a celebrity-expert summit. If Encore drifts into generic midlife/purpose/wellness content, it becomes a thinner ROAR. Stay on doing/building + peer deal flow + reader-funded — the lanes ROAR structurally cannot follow.</w:t>
+      </w:r>
+    </w:p>
+    <w:p>
+      <w:pPr>
+        <w:spacing w:before="260" w:after="80"/>
+        <w:pBdr>
+          <w:bottom w:val="single" w:sz="6" w:space="2" w:color="B08D57"/>
+        </w:pBdr>
+      </w:pPr>
+      <w:r>
+        <w:rPr>
+          <w:b/>
+          <w:color w:val="6E2A35"/>
+          <w:sz w:val="30"/>
+        </w:rPr>
         <w:t>The name — an honest flag</w:t>
       </w:r>
     </w:p>

</xml_diff>